<commit_message>
Add linked contents and Google Docs compatible headings
</commit_message>
<xml_diff>
--- a/report_450389.docx
+++ b/report_450389.docx
@@ -153,13 +153,126 @@
     <w:p>
       <w:pPr>
         <w:pStyle w:val="Мойтекст"/>
+        <w:spacing w:after="120"/>
         <w:ind w:firstLine="0"/>
       </w:pPr>
-      <w:fldSimple w:instr="TOC \t &quot;Мой заголовок,1,Мой подзаголовок,2,Мой подподзаголовок,2&quot; \h \z">
+      <w:r>
+        <w:fldChar w:fldCharType="begin"/>
+      </w:r>
+      <w:r>
+        <w:instrText xml:space="preserve"> TOC \o "1-3" \h \z \u \n </w:instrText>
+      </w:r>
+      <w:r>
+        <w:fldChar w:fldCharType="separate"/>
+      </w:r>
+      <w:hyperlink w:anchor="report_section_1" w:history="1">
         <w:r>
-          <w:t>Для формирования оглавления выделите документ (Ctrl+A) и обновите поля (F9).</w:t>
+          <w:rPr>
+            <w:color w:val="1155CC"/>
+            <w:u w:val="single"/>
+          </w:rPr>
+          <w:t>Задание 1. Расчёт размещения файла на диске</w:t>
         </w:r>
-      </w:fldSimple>
+      </w:hyperlink>
+    </w:p>
+    <w:p>
+      <w:pPr>
+        <w:pStyle w:val="Мойтекст"/>
+        <w:spacing w:after="120"/>
+        <w:ind w:firstLine="0"/>
+      </w:pPr>
+      <w:hyperlink w:anchor="report_section_2" w:history="1">
+        <w:r>
+          <w:rPr>
+            <w:color w:val="1155CC"/>
+            <w:u w:val="single"/>
+          </w:rPr>
+          <w:t>Задание 2. Создание структуры каталогов</w:t>
+        </w:r>
+      </w:hyperlink>
+    </w:p>
+    <w:p>
+      <w:pPr>
+        <w:pStyle w:val="Мойтекст"/>
+        <w:spacing w:after="120"/>
+        <w:ind w:firstLine="0"/>
+      </w:pPr>
+      <w:hyperlink w:anchor="report_section_3" w:history="1">
+        <w:r>
+          <w:rPr>
+            <w:color w:val="1155CC"/>
+            <w:u w:val="single"/>
+          </w:rPr>
+          <w:t>Задание 3. Копирование растрового изображения</w:t>
+        </w:r>
+      </w:hyperlink>
+    </w:p>
+    <w:p>
+      <w:pPr>
+        <w:pStyle w:val="Мойтекст"/>
+        <w:spacing w:after="120"/>
+        <w:ind w:firstLine="0"/>
+      </w:pPr>
+      <w:hyperlink w:anchor="report_section_4" w:history="1">
+        <w:r>
+          <w:rPr>
+            <w:color w:val="1155CC"/>
+            <w:u w:val="single"/>
+          </w:rPr>
+          <w:t>Задание 4. Изменение пиксельных данных BMP</w:t>
+        </w:r>
+      </w:hyperlink>
+    </w:p>
+    <w:p>
+      <w:pPr>
+        <w:pStyle w:val="Мойтекст"/>
+        <w:spacing w:after="120"/>
+        <w:ind w:firstLine="0"/>
+      </w:pPr>
+      <w:hyperlink w:anchor="report_section_5" w:history="1">
+        <w:r>
+          <w:rPr>
+            <w:color w:val="1155CC"/>
+            <w:u w:val="single"/>
+          </w:rPr>
+          <w:t>Задание 5. Копирование ярлыка</w:t>
+        </w:r>
+      </w:hyperlink>
+    </w:p>
+    <w:p>
+      <w:pPr>
+        <w:pStyle w:val="Мойтекст"/>
+        <w:spacing w:after="120"/>
+        <w:ind w:firstLine="0"/>
+      </w:pPr>
+      <w:hyperlink w:anchor="report_section_6" w:history="1">
+        <w:r>
+          <w:rPr>
+            <w:color w:val="1155CC"/>
+            <w:u w:val="single"/>
+          </w:rPr>
+          <w:t>Задание 6. Вывод дерева папок и файлов</w:t>
+        </w:r>
+      </w:hyperlink>
+    </w:p>
+    <w:p>
+      <w:pPr>
+        <w:pStyle w:val="Мойтекст"/>
+        <w:spacing w:after="120"/>
+        <w:ind w:firstLine="0"/>
+      </w:pPr>
+      <w:hyperlink w:anchor="report_section_7" w:history="1">
+        <w:r>
+          <w:rPr>
+            <w:color w:val="1155CC"/>
+            <w:u w:val="single"/>
+          </w:rPr>
+          <w:t>Задание 7. Сортировка файлов командным файлом</w:t>
+        </w:r>
+      </w:hyperlink>
+      <w:r>
+        <w:fldChar w:fldCharType="end"/>
+      </w:r>
     </w:p>
     <w:p>
       <w:r>
@@ -167,12 +280,14 @@
       </w:r>
     </w:p>
     <w:p>
-      <w:pPr>
-        <w:pStyle w:val="Мойзаголовок"/>
+      <w:bookmarkStart w:id="201" w:name="report_section_1"/>
+      <w:pPr>
+        <w:pStyle w:val="Heading1"/>
       </w:pPr>
       <w:r>
         <w:t>Задание 1. Расчёт размещения файла на диске</w:t>
       </w:r>
+      <w:bookmarkEnd w:id="201"/>
     </w:p>
     <w:p>
       <w:pPr>
@@ -223,12 +338,14 @@
       </w:r>
     </w:p>
     <w:p>
-      <w:pPr>
-        <w:pStyle w:val="Мойзаголовок"/>
+      <w:bookmarkStart w:id="202" w:name="report_section_2"/>
+      <w:pPr>
+        <w:pStyle w:val="Heading1"/>
       </w:pPr>
       <w:r>
         <w:t>Задание 2. Создание структуры каталогов</w:t>
       </w:r>
+      <w:bookmarkEnd w:id="202"/>
     </w:p>
     <w:p>
       <w:pPr>
@@ -339,12 +456,14 @@
       </w:r>
     </w:p>
     <w:p>
-      <w:pPr>
-        <w:pStyle w:val="Мойзаголовок"/>
+      <w:bookmarkStart w:id="203" w:name="report_section_3"/>
+      <w:pPr>
+        <w:pStyle w:val="Heading1"/>
       </w:pPr>
       <w:r>
         <w:t>Задание 3. Копирование растрового изображения</w:t>
       </w:r>
+      <w:bookmarkEnd w:id="203"/>
     </w:p>
     <w:p>
       <w:pPr>
@@ -405,12 +524,14 @@
       </w:r>
     </w:p>
     <w:p>
-      <w:pPr>
-        <w:pStyle w:val="Мойзаголовок"/>
+      <w:bookmarkStart w:id="204" w:name="report_section_4"/>
+      <w:pPr>
+        <w:pStyle w:val="Heading1"/>
       </w:pPr>
       <w:r>
         <w:t>Задание 4. Изменение пиксельных данных BMP</w:t>
       </w:r>
+      <w:bookmarkEnd w:id="204"/>
     </w:p>
     <w:p>
       <w:pPr>
@@ -487,12 +608,14 @@
       </w:r>
     </w:p>
     <w:p>
-      <w:pPr>
-        <w:pStyle w:val="Мойзаголовок"/>
+      <w:bookmarkStart w:id="205" w:name="report_section_5"/>
+      <w:pPr>
+        <w:pStyle w:val="Heading1"/>
       </w:pPr>
       <w:r>
         <w:t>Задание 5. Копирование ярлыка</w:t>
       </w:r>
+      <w:bookmarkEnd w:id="205"/>
     </w:p>
     <w:p>
       <w:pPr>
@@ -571,12 +694,14 @@
       </w:r>
     </w:p>
     <w:p>
-      <w:pPr>
-        <w:pStyle w:val="Мойзаголовок"/>
+      <w:bookmarkStart w:id="206" w:name="report_section_6"/>
+      <w:pPr>
+        <w:pStyle w:val="Heading1"/>
       </w:pPr>
       <w:r>
         <w:t>Задание 6. Вывод дерева папок и файлов</w:t>
       </w:r>
+      <w:bookmarkEnd w:id="206"/>
     </w:p>
     <w:p>
       <w:pPr>
@@ -637,12 +762,14 @@
       </w:r>
     </w:p>
     <w:p>
-      <w:pPr>
-        <w:pStyle w:val="Мойзаголовок"/>
+      <w:bookmarkStart w:id="207" w:name="report_section_7"/>
+      <w:pPr>
+        <w:pStyle w:val="Heading1"/>
       </w:pPr>
       <w:r>
         <w:t>Задание 7. Сортировка файлов командным файлом</w:t>
       </w:r>
+      <w:bookmarkEnd w:id="207"/>
     </w:p>
     <w:p>
       <w:pPr>
@@ -4414,31 +4541,30 @@
   </w:style>
   <w:style w:type="paragraph" w:styleId="Heading1">
     <w:name w:val="heading 1"/>
-    <w:basedOn w:val="Normal"/>
-    <w:next w:val="Normal"/>
+    <w:basedOn w:val="Мойтекст"/>
+    <w:next w:val="Мойтекст"/>
     <w:link w:val="Heading1Char"/>
     <w:uiPriority w:val="9"/>
     <w:qFormat/>
     <w:rsid w:val="00FC693F"/>
     <w:pPr>
       <w:keepNext/>
-      <w:keepLines/>
-      <w:spacing w:before="480" w:after="0"/>
+      <w:spacing w:line="360" w:lineRule="auto" w:before="200" w:after="100"/>
+      <w:ind w:left="567" w:firstLine="0"/>
+      <w:jc w:val="left"/>
       <w:outlineLvl w:val="0"/>
     </w:pPr>
     <w:rPr>
-      <w:rFonts w:asciiTheme="majorHAnsi" w:eastAsiaTheme="majorEastAsia" w:hAnsiTheme="majorHAnsi" w:cstheme="majorBidi"/>
+      <w:rFonts w:ascii="Arial" w:hAnsi="Arial" w:eastAsia="Arial"/>
       <w:b/>
-      <w:bCs/>
-      <w:color w:val="365F91" w:themeColor="accent1" w:themeShade="BF"/>
       <w:sz w:val="28"/>
-      <w:szCs w:val="28"/>
+      <w:u w:val="single"/>
     </w:rPr>
   </w:style>
   <w:style w:type="paragraph" w:styleId="Heading2">
     <w:name w:val="heading 2"/>
-    <w:basedOn w:val="Normal"/>
-    <w:next w:val="Normal"/>
+    <w:basedOn w:val="Мойтекст"/>
+    <w:next w:val="Мойтекст"/>
     <w:link w:val="Heading2Char"/>
     <w:uiPriority w:val="9"/>
     <w:unhideWhenUsed/>
@@ -4446,23 +4572,22 @@
     <w:rsid w:val="00FC693F"/>
     <w:pPr>
       <w:keepNext/>
-      <w:keepLines/>
-      <w:spacing w:before="200" w:after="0"/>
+      <w:spacing w:line="240" w:lineRule="auto" w:before="200" w:after="100"/>
+      <w:ind w:left="567" w:firstLine="0"/>
+      <w:jc w:val="left"/>
       <w:outlineLvl w:val="1"/>
     </w:pPr>
     <w:rPr>
-      <w:rFonts w:asciiTheme="majorHAnsi" w:eastAsiaTheme="majorEastAsia" w:hAnsiTheme="majorHAnsi" w:cstheme="majorBidi"/>
+      <w:rFonts w:ascii="Arial" w:hAnsi="Arial" w:eastAsia="Arial"/>
       <w:b/>
-      <w:bCs/>
-      <w:color w:val="4F81BD" w:themeColor="accent1"/>
-      <w:sz w:val="26"/>
-      <w:szCs w:val="26"/>
+      <w:sz w:val="24"/>
+      <w:u w:val="none"/>
     </w:rPr>
   </w:style>
   <w:style w:type="paragraph" w:styleId="Heading3">
     <w:name w:val="heading 3"/>
-    <w:basedOn w:val="Normal"/>
-    <w:next w:val="Normal"/>
+    <w:basedOn w:val="Мойтекст"/>
+    <w:next w:val="Мойтекст"/>
     <w:link w:val="Heading3Char"/>
     <w:uiPriority w:val="9"/>
     <w:unhideWhenUsed/>
@@ -4470,15 +4595,16 @@
     <w:rsid w:val="00FC693F"/>
     <w:pPr>
       <w:keepNext/>
-      <w:keepLines/>
-      <w:spacing w:before="200" w:after="0"/>
-      <w:outlineLvl w:val="2"/>
+      <w:spacing w:line="240" w:lineRule="auto" w:before="200" w:after="100"/>
+      <w:ind w:left="567" w:firstLine="0"/>
+      <w:jc w:val="left"/>
+      <w:outlineLvl w:val="1"/>
     </w:pPr>
     <w:rPr>
-      <w:rFonts w:asciiTheme="majorHAnsi" w:eastAsiaTheme="majorEastAsia" w:hAnsiTheme="majorHAnsi" w:cstheme="majorBidi"/>
+      <w:rFonts w:ascii="Arial" w:hAnsi="Arial" w:eastAsia="Arial"/>
       <w:b/>
-      <w:bCs/>
-      <w:color w:val="4F81BD" w:themeColor="accent1"/>
+      <w:sz w:val="20"/>
+      <w:u w:val="none"/>
     </w:rPr>
   </w:style>
   <w:style w:type="paragraph" w:styleId="Heading4">

</xml_diff>

<commit_message>
Update report cover with student and instructor details
</commit_message>
<xml_diff>
--- a/report_450389.docx
+++ b/report_450389.docx
@@ -5,133 +5,120 @@
     <w:p>
       <w:pPr>
         <w:pStyle w:val="Мойтекст"/>
-        <w:ind w:firstLine="0"/>
-        <w:jc w:val="center"/>
+        <w:keepNext/>
+        <w:spacing w:before="0" w:after="0" w:line="240" w:lineRule="auto"/>
+        <w:ind w:firstLine="0" w:left="0" w:right="0"/>
+        <w:jc w:val="left"/>
       </w:pPr>
       <w:r>
-        <w:t>[Название учебного заведения]</w:t>
+        <w:rPr>
+          <w:rFonts w:ascii="Times New Roman" w:hAnsi="Times New Roman"/>
+          <w:b/>
+          <w:sz w:val="20"/>
+          <w:u w:val="none"/>
+        </w:rPr>
+        <w:t>МИНИСТЕРСТВО НАУКИ И ВЫСШЕГО ОБРАЗОВАНИЯ РОССИЙСКОЙ ФЕДЕРАЦИИ</w:t>
+        <w:br/>
+        <w:t>ФЕДЕРАЛЬНОЕ ГОСУДАРСТВЕННОЕ АВТОНОМНОЕ ОБРАЗОВАТЕЛЬНОЕ</w:t>
+        <w:br/>
+        <w:t>УЧРЕЖДЕНИЕ ВЫСШЕГО ОБРАЗОВАНИЯ</w:t>
+        <w:br/>
+        <w:t>«НАЦИОНАЛЬНЫЙ ИССЛЕДОВАТЕЛЬСКИЙ УНИВЕРСИТЕТ ИТМО»</w:t>
+        <w:br/>
+        <w:t>МЕГАФАКУЛЬТЕТ КОМПЬЮТЕРНЫХ ТЕХНОЛОГИЙ И УПРАВЛЕНИЯ</w:t>
+        <w:br/>
+        <w:t>ФАКУЛЬТЕТ ПРОГРАММНОЙ ИНЖЕНЕРИИ И КОМПЬЮТЕРНОЙ ТЕХНИКИ</w:t>
       </w:r>
     </w:p>
     <w:p>
       <w:pPr>
         <w:pStyle w:val="Мойтекст"/>
-        <w:ind w:firstLine="0"/>
+        <w:keepNext/>
+        <w:spacing w:before="4000" w:after="0" w:line="240" w:lineRule="auto"/>
+        <w:ind w:firstLine="0" w:left="0" w:right="0"/>
         <w:jc w:val="center"/>
       </w:pPr>
       <w:r>
-        <w:t>[Факультет / кафедра]</w:t>
+        <w:rPr>
+          <w:rFonts w:ascii="Arial" w:hAnsi="Arial"/>
+          <w:b/>
+          <w:color w:val="365F91"/>
+          <w:sz w:val="28"/>
+          <w:u w:val="single"/>
+        </w:rPr>
+        <w:t>ОТЧЁТ ПО ЛАБОРАТОРНОЙ РАБОТЕ № 1</w:t>
       </w:r>
     </w:p>
     <w:p>
       <w:pPr>
         <w:pStyle w:val="Мойтекст"/>
-        <w:ind w:firstLine="0"/>
-        <w:jc w:val="center"/>
-      </w:pPr>
-    </w:p>
-    <w:p>
-      <w:pPr>
-        <w:pStyle w:val="Мойтекст"/>
-        <w:ind w:firstLine="0"/>
-        <w:jc w:val="center"/>
-      </w:pPr>
-    </w:p>
-    <w:p>
-      <w:pPr>
-        <w:pStyle w:val="Мойтекст"/>
-        <w:ind w:firstLine="0"/>
-        <w:jc w:val="center"/>
+        <w:keepNext/>
+        <w:spacing w:before="2900" w:after="100" w:line="240" w:lineRule="auto"/>
+        <w:ind w:firstLine="0" w:left="0" w:right="0"/>
+        <w:jc w:val="right"/>
       </w:pPr>
       <w:r>
-        <w:t>ОТЧЁТ ПО ЛАБОРАТОРНОЙ РАБОТЕ</w:t>
+        <w:rPr>
+          <w:rFonts w:ascii="Times New Roman" w:hAnsi="Times New Roman"/>
+          <w:b w:val="0"/>
+          <w:sz w:val="20"/>
+          <w:u w:val="none"/>
+        </w:rPr>
+        <w:t>Студент: Садовщикова София Ивановна</w:t>
       </w:r>
     </w:p>
     <w:p>
       <w:pPr>
         <w:pStyle w:val="Мойтекст"/>
-        <w:ind w:firstLine="0"/>
-        <w:jc w:val="center"/>
+        <w:keepNext/>
+        <w:spacing w:before="0" w:after="100" w:line="240" w:lineRule="auto"/>
+        <w:ind w:firstLine="0" w:left="0" w:right="0"/>
+        <w:jc w:val="right"/>
       </w:pPr>
       <w:r>
-        <w:t>Работа с файловой системой и командной строкой Windows</w:t>
+        <w:rPr>
+          <w:rFonts w:ascii="Times New Roman" w:hAnsi="Times New Roman"/>
+          <w:b w:val="0"/>
+          <w:sz w:val="20"/>
+          <w:u w:val="none"/>
+        </w:rPr>
+        <w:t>Группа: P3268</w:t>
       </w:r>
     </w:p>
     <w:p>
       <w:pPr>
         <w:pStyle w:val="Мойтекст"/>
-        <w:ind w:firstLine="0"/>
-        <w:jc w:val="center"/>
-      </w:pPr>
-    </w:p>
-    <w:p>
-      <w:pPr>
-        <w:pStyle w:val="Мойтекст"/>
-        <w:ind w:firstLine="0"/>
-        <w:jc w:val="center"/>
-      </w:pPr>
-    </w:p>
-    <w:p>
-      <w:pPr>
-        <w:pStyle w:val="Мойтекст"/>
-        <w:ind w:firstLine="0"/>
-        <w:jc w:val="center"/>
+        <w:keepNext/>
+        <w:spacing w:before="0" w:after="0" w:line="240" w:lineRule="auto"/>
+        <w:ind w:firstLine="0" w:left="0" w:right="0"/>
+        <w:jc w:val="right"/>
       </w:pPr>
       <w:r>
-        <w:t>Выполнила: [ФИО]</w:t>
+        <w:rPr>
+          <w:rFonts w:ascii="Times New Roman" w:hAnsi="Times New Roman"/>
+          <w:b w:val="0"/>
+          <w:sz w:val="20"/>
+          <w:u w:val="none"/>
+        </w:rPr>
+        <w:t>Преподаватель: Климов Игорь Викторович</w:t>
       </w:r>
     </w:p>
     <w:p>
       <w:pPr>
         <w:pStyle w:val="Мойтекст"/>
-        <w:ind w:firstLine="0"/>
+        <w:keepNext w:val="0"/>
+        <w:spacing w:before="1900" w:after="0" w:line="240" w:lineRule="auto"/>
+        <w:ind w:firstLine="0" w:left="0" w:right="0"/>
         <w:jc w:val="center"/>
       </w:pPr>
       <w:r>
-        <w:t>Номер ИСУ: 450389</w:t>
-      </w:r>
-    </w:p>
-    <w:p>
-      <w:pPr>
-        <w:pStyle w:val="Мойтекст"/>
-        <w:ind w:firstLine="0"/>
-        <w:jc w:val="center"/>
-      </w:pPr>
-      <w:r>
-        <w:t>Группа: [группа]</w:t>
-      </w:r>
-    </w:p>
-    <w:p>
-      <w:pPr>
-        <w:pStyle w:val="Мойтекст"/>
-        <w:ind w:firstLine="0"/>
-        <w:jc w:val="center"/>
-      </w:pPr>
-      <w:r>
-        <w:t>Проверил(а): [ФИО преподавателя]</w:t>
-      </w:r>
-    </w:p>
-    <w:p>
-      <w:pPr>
-        <w:pStyle w:val="Мойтекст"/>
-        <w:ind w:firstLine="0"/>
-        <w:jc w:val="center"/>
-      </w:pPr>
-    </w:p>
-    <w:p>
-      <w:pPr>
-        <w:pStyle w:val="Мойтекст"/>
-        <w:ind w:firstLine="0"/>
-        <w:jc w:val="center"/>
-      </w:pPr>
-    </w:p>
-    <w:p>
-      <w:pPr>
-        <w:pStyle w:val="Мойтекст"/>
-        <w:ind w:firstLine="0"/>
-        <w:jc w:val="center"/>
-      </w:pPr>
-      <w:r>
-        <w:t>[Город] — [год]</w:t>
+        <w:rPr>
+          <w:rFonts w:ascii="Times New Roman" w:hAnsi="Times New Roman"/>
+          <w:b w:val="0"/>
+          <w:sz w:val="20"/>
+          <w:u w:val="none"/>
+        </w:rPr>
+        <w:t>Санкт-Петербург  2026</w:t>
       </w:r>
     </w:p>
     <w:p>
@@ -4090,6 +4077,7 @@
       <w:pgSz w:w="11906" w:h="16838"/>
       <w:pgMar w:top="1134" w:right="850" w:bottom="1134" w:left="1701" w:header="720" w:footer="720" w:gutter="0"/>
       <w:cols w:space="720"/>
+      <w:titlePg/>
       <w:docGrid w:linePitch="360"/>
     </w:sectPr>
   </w:body>

</xml_diff>

<commit_message>
Rename screenshot captions and remove gap after contents
</commit_message>
<xml_diff>
--- a/report_450389.docx
+++ b/report_450389.docx
@@ -262,14 +262,10 @@
       </w:r>
     </w:p>
     <w:p>
-      <w:r>
-        <w:br w:type="page"/>
-      </w:r>
-    </w:p>
-    <w:p>
       <w:bookmarkStart w:id="201" w:name="report_section_1"/>
       <w:pPr>
         <w:pStyle w:val="Heading1"/>
+        <w:spacing w:before="320"/>
       </w:pPr>
       <w:r>
         <w:t>Задание 1. Расчёт размещения файла на диске</w:t>
@@ -389,7 +385,7 @@
         <w:keepNext w:val="0"/>
       </w:pPr>
       <w:r>
-        <w:t>Рисунок 1 — Создание структуры каталогов</w:t>
+        <w:t>Скриншот 1 — Создание структуры каталогов</w:t>
       </w:r>
     </w:p>
     <w:p>
@@ -439,7 +435,7 @@
         <w:keepNext w:val="0"/>
       </w:pPr>
       <w:r>
-        <w:t>Рисунок 2 — Полученная структура каталогов</w:t>
+        <w:t>Скриншот 2 — Полученная структура каталогов</w:t>
       </w:r>
     </w:p>
     <w:p>
@@ -507,7 +503,7 @@
         <w:keepNext w:val="0"/>
       </w:pPr>
       <w:r>
-        <w:t>Рисунок 3 — Копирование white.bmp в random.bmp</w:t>
+        <w:t>Скриншот 3 — Копирование white.bmp в random.bmp</w:t>
       </w:r>
     </w:p>
     <w:p>
@@ -591,7 +587,7 @@
         <w:keepNext w:val="0"/>
       </w:pPr>
       <w:r>
-        <w:t>Рисунок 4 — Заголовок BMP и изменённые пиксельные данные</w:t>
+        <w:t>Скриншот 4 — Заголовок BMP и изменённые пиксельные данные</w:t>
       </w:r>
     </w:p>
     <w:p>
@@ -659,7 +655,7 @@
         <w:keepNext w:val="0"/>
       </w:pPr>
       <w:r>
-        <w:t>Рисунок 5 — Копирование ярлыка в каталог ЯРЛЫКИ</w:t>
+        <w:t>Скриншот 5 — Копирование ярлыка в каталог ЯРЛЫКИ</w:t>
       </w:r>
     </w:p>
     <w:p>
@@ -677,7 +673,7 @@
         <w:keepNext w:val="0"/>
       </w:pPr>
       <w:r>
-        <w:t>Рисунок 6 — Ярлык ХАКЕР на рабочем столе</w:t>
+        <w:t>Скриншот 6 — Ярлык ХАКЕР на рабочем столе</w:t>
       </w:r>
     </w:p>
     <w:p>
@@ -745,7 +741,7 @@
         <w:keepNext w:val="0"/>
       </w:pPr>
       <w:r>
-        <w:t>Рисунок 7 — Дерево каталогов и файлов</w:t>
+        <w:t>Скриншот 7 — Дерево каталогов и файлов</w:t>
       </w:r>
     </w:p>
     <w:p>
@@ -813,7 +809,7 @@
         <w:keepNext w:val="0"/>
       </w:pPr>
       <w:r>
-        <w:t>Рисунок 8 — Запуск командного файла sort.bat</w:t>
+        <w:t>Скриншот 8 — Запуск командного файла sort.bat</w:t>
       </w:r>
     </w:p>
     <w:p>

</xml_diff>

<commit_message>
Restore separate contents page and fit screenshot after task text
</commit_message>
<xml_diff>
--- a/report_450389.docx
+++ b/report_450389.docx
@@ -262,10 +262,15 @@
       </w:r>
     </w:p>
     <w:p>
+      <w:r>
+        <w:br w:type="page"/>
+      </w:r>
+    </w:p>
+    <w:p>
       <w:bookmarkStart w:id="201" w:name="report_section_1"/>
       <w:pPr>
         <w:pStyle w:val="Heading1"/>
-        <w:spacing w:before="320"/>
+        <w:spacing w:before="200"/>
       </w:pPr>
       <w:r>
         <w:t>Задание 1. Расчёт размещения файла на диске</w:t>
@@ -333,6 +338,7 @@
     <w:p>
       <w:pPr>
         <w:pStyle w:val="Мойтекст"/>
+        <w:keepNext/>
       </w:pPr>
       <w:r>
         <w:t>На диске F: использован каталог Садовщикова. В командной строке командами mkdir созданы папки 3Д, 450389, ДОКУМЕНТЫ, ИЗОБРАЖЕНИЯ, МОИПРОГРАММЫ, ПРОГРАММЫ, ТЕКСТЫ и ЯРЛЫКИ. В ИЗОБРАЖЕНИЯ созданы подпапки ВЕКТОРНЫЕ, ИКОНКИ и РАСТРОВЫЕ, а в ПРОГРАММЫ — подпапка ХАКЕР. Переход между каталогами выполнялся командами cd.</w:t>
@@ -342,12 +348,14 @@
       <w:pPr>
         <w:pStyle w:val="Мойтекст"/>
         <w:keepNext/>
+        <w:spacing w:before="60"/>
         <w:ind w:firstLine="0" w:left="0"/>
+        <w:jc w:val="center"/>
       </w:pPr>
       <w:r>
         <w:drawing>
           <wp:inline xmlns:a="http://schemas.openxmlformats.org/drawingml/2006/main" xmlns:pic="http://schemas.openxmlformats.org/drawingml/2006/picture">
-            <wp:extent cx="5688000" cy="7160787"/>
+            <wp:extent cx="4146382" cy="5220000"/>
             <wp:docPr id="1" name="Picture 1"/>
             <wp:cNvGraphicFramePr>
               <a:graphicFrameLocks noChangeAspect="1"/>
@@ -368,7 +376,7 @@
                   <pic:spPr>
                     <a:xfrm>
                       <a:off x="0" y="0"/>
-                      <a:ext cx="5688000" cy="7160787"/>
+                      <a:ext cx="4146382" cy="5220000"/>
                     </a:xfrm>
                     <a:prstGeom prst="rect"/>
                   </pic:spPr>

</xml_diff>